<commit_message>
expand lab 6 report evidence
</commit_message>
<xml_diff>
--- a/docs/reports/2315302125 崔子霖6.docx
+++ b/docs/reports/2315302125 崔子霖6.docx
@@ -809,21 +809,21 @@
           <w:b w:val="0"/>
           <w:sz w:val="24"/>
         </w:rPr>
-        <w:t>本实验围绕“ROS 机器人语音识别和自主导航综合实例”展开，在 Ubuntu 20.04、ROS Noetic、Gazebo 11 与 RViz 环境中完成移动机器人建图、定位、路径规划、命名航点管理以及语音指令触发导航的完整流程。实验目标是在仿真家庭场景中让机器人能够先建立环境地图，再基于地图进行自主导航，并根据语音指令前往指定房间。</w:t>
-      </w:r>
-    </w:p>
-    <w:p>
-      <w:pPr>
-        <w:spacing w:line="360" w:lineRule="auto"/>
-        <w:jc w:val="left"/>
-      </w:pPr>
-      <w:r>
-        <w:rPr>
-          <w:rFonts w:ascii="Times New Roman" w:hAnsi="Times New Roman" w:eastAsia="宋体"/>
-          <w:b w:val="0"/>
-          <w:sz w:val="24"/>
-        </w:rPr>
-        <w:t>实验过程中，建图阶段通过 gmapping 节点融合激光雷达与里程计信息生成 /map；导航阶段通过 map_server 加载保存的地图文件，amcl 完成定位，move_base 负责全局路径规划与局部避障，waterplus_map_tools 中的 wp_manager 与 wp_navi_server 则分别实现航点管理和按名称导航。最后通过语音识别结果话题 /xfyun/iat 与命名航点话题 /waterplus/navi_waypoint 的联动，实现“Go to the kitchen”等指令触发导航。</w:t>
+        <w:t>本实验围绕“ROS 机器人语音识别和自主导航综合实例”展开，在 Ubuntu 20.04、ROS Noetic、Gazebo 11 与 RViz 环境中完成移动机器人建图、定位、路径规划、命名航点管理以及语音指令触发导航的完整流程。实验目标是在仿真家庭场景中让机器人先建立环境地图，再基于地图完成自主导航，并根据语音命令前往指定房间。</w:t>
+      </w:r>
+    </w:p>
+    <w:p>
+      <w:pPr>
+        <w:spacing w:line="360" w:lineRule="auto"/>
+        <w:jc w:val="left"/>
+      </w:pPr>
+      <w:r>
+        <w:rPr>
+          <w:rFonts w:ascii="Times New Roman" w:hAnsi="Times New Roman" w:eastAsia="宋体"/>
+          <w:b w:val="0"/>
+          <w:sz w:val="24"/>
+        </w:rPr>
+        <w:t>实验的核心链路可以概括为三段：第一段是 SLAM 建图，利用激光雷达与里程计估计生成 /map；第二段是导航系统启动，利用 map_server、amcl 与 move_base 在已知地图上完成定位和路径规划；第三段是语音导航联动，利用 /xfyun/iat 语音识别结果映射到命名航点，再由 /waterplus/navi_waypoint 触发 wp_navi_server 发起导航。</w:t>
       </w:r>
     </w:p>
     <w:p>
@@ -875,63 +875,49 @@
           <w:b w:val="0"/>
           <w:sz w:val="24"/>
         </w:rPr>
-        <w:t>1. 在 Gazebo 仿真环境中运行 SLAM 建图，控制机器人在室内场景中运动并生成地图；</w:t>
-      </w:r>
-    </w:p>
-    <w:p>
-      <w:pPr>
-        <w:spacing w:line="360" w:lineRule="auto"/>
-        <w:jc w:val="left"/>
-      </w:pPr>
-      <w:r>
-        <w:rPr>
-          <w:rFonts w:ascii="Times New Roman" w:hAnsi="Times New Roman" w:eastAsia="宋体"/>
-          <w:b w:val="0"/>
-          <w:sz w:val="24"/>
-        </w:rPr>
-        <w:t>2. 使用 map_server 将生成的地图保存为 map.pgm 与 map.yaml 文件，并复制到 wpr_simulation/maps/ 目录；</w:t>
-      </w:r>
-    </w:p>
-    <w:p>
-      <w:pPr>
-        <w:spacing w:line="360" w:lineRule="auto"/>
-        <w:jc w:val="left"/>
-      </w:pPr>
-      <w:r>
-        <w:rPr>
-          <w:rFonts w:ascii="Times New Roman" w:hAnsi="Times New Roman" w:eastAsia="宋体"/>
-          <w:b w:val="0"/>
-          <w:sz w:val="24"/>
-        </w:rPr>
-        <w:t>3. 启动自主导航仿真，使用 RViz 中的 2D Pose Estimate、2D Nav Goal 与 Add Waypoint 工具完成定位、目标点设置和航点记录；</w:t>
-      </w:r>
-    </w:p>
-    <w:p>
-      <w:pPr>
-        <w:spacing w:line="360" w:lineRule="auto"/>
-        <w:jc w:val="left"/>
-      </w:pPr>
-      <w:r>
-        <w:rPr>
-          <w:rFonts w:ascii="Times New Roman" w:hAnsi="Times New Roman" w:eastAsia="宋体"/>
-          <w:b w:val="0"/>
-          <w:sz w:val="24"/>
-        </w:rPr>
-        <w:t>4. 建立语音识别结果与命名航点之间的映射关系，使机器人能够根据“Go to the kitchen / living room / dining room / bedroom”等语音指令执行导航；</w:t>
-      </w:r>
-    </w:p>
-    <w:p>
-      <w:pPr>
-        <w:spacing w:line="360" w:lineRule="auto"/>
-        <w:jc w:val="left"/>
-      </w:pPr>
-      <w:r>
-        <w:rPr>
-          <w:rFonts w:ascii="Times New Roman" w:hAnsi="Times New Roman" w:eastAsia="宋体"/>
-          <w:b w:val="0"/>
-          <w:sz w:val="24"/>
-        </w:rPr>
-        <w:t>5. 对实验环境、操作步骤、关键结果和遇到的问题进行总结，并完成实验报告。</w:t>
+        <w:t>1. 在 Gazebo 仿真环境中完成 Gmapping 建图，并保存地图文件；</w:t>
+      </w:r>
+    </w:p>
+    <w:p>
+      <w:pPr>
+        <w:spacing w:line="360" w:lineRule="auto"/>
+        <w:jc w:val="left"/>
+      </w:pPr>
+      <w:r>
+        <w:rPr>
+          <w:rFonts w:ascii="Times New Roman" w:hAnsi="Times New Roman" w:eastAsia="宋体"/>
+          <w:b w:val="0"/>
+          <w:sz w:val="24"/>
+        </w:rPr>
+        <w:t>2. 启动自主导航系统，完成初始位姿设置、目标点导航和命名航点管理；</w:t>
+      </w:r>
+    </w:p>
+    <w:p>
+      <w:pPr>
+        <w:spacing w:line="360" w:lineRule="auto"/>
+        <w:jc w:val="left"/>
+      </w:pPr>
+      <w:r>
+        <w:rPr>
+          <w:rFonts w:ascii="Times New Roman" w:hAnsi="Times New Roman" w:eastAsia="宋体"/>
+          <w:b w:val="0"/>
+          <w:sz w:val="24"/>
+        </w:rPr>
+        <w:t>3. 实现语音识别结果与命名航点之间的映射关系，使机器人能够根据房间名称执行导航；</w:t>
+      </w:r>
+    </w:p>
+    <w:p>
+      <w:pPr>
+        <w:spacing w:line="360" w:lineRule="auto"/>
+        <w:jc w:val="left"/>
+      </w:pPr>
+      <w:r>
+        <w:rPr>
+          <w:rFonts w:ascii="Times New Roman" w:hAnsi="Times New Roman" w:eastAsia="宋体"/>
+          <w:b w:val="0"/>
+          <w:sz w:val="24"/>
+        </w:rPr>
+        <w:t>4. 对实验环境、关键节点、关键话题、实验数据和运行结果进行截图记录，并形成完整报告。</w:t>
       </w:r>
     </w:p>
     <w:p>
@@ -968,35 +954,21 @@
           <w:b w:val="0"/>
           <w:sz w:val="24"/>
         </w:rPr>
-        <w:t>本实验采用“建图层 + 地图服务层 + 定位与规划层 + 航点管理层 + 语音触发层”的分层设计。首先由 wpb_gmapping.launch 启动 Gazebo 仿真场景、机器人模型和 slam_gmapping 节点完成地图构建；地图保存后，再由导航启动文件加载地图、定位与规划组件，实现机器人从已知初始位姿出发到目标航点的自动行走。</w:t>
-      </w:r>
-    </w:p>
-    <w:p>
-      <w:pPr>
-        <w:spacing w:line="360" w:lineRule="auto"/>
-        <w:jc w:val="left"/>
-      </w:pPr>
-      <w:r>
-        <w:rPr>
-          <w:rFonts w:ascii="Times New Roman" w:hAnsi="Times New Roman" w:eastAsia="宋体"/>
-          <w:b w:val="0"/>
-          <w:sz w:val="24"/>
-        </w:rPr>
-        <w:t>系统模块关系如下：slam_gmapping 节点持续发布 /map；map_server 重新加载保存好的地图；amcl 订阅激光数据与里程计估计机器人在 map 坐标系下的位置；move_base 接收 /move_base_simple/goal 或 wp_navi_server 转发的目标点并生成路径；wp_manager 订阅 /waterplus/add_waypoint 记录命名航点；语音桥接节点订阅 /xfyun/iat，将识别到的房间名称转换为 /waterplus/navi_waypoint 命令。</w:t>
-      </w:r>
-    </w:p>
-    <w:p>
-      <w:pPr>
-        <w:spacing w:line="360" w:lineRule="auto"/>
-        <w:jc w:val="left"/>
-      </w:pPr>
-      <w:r>
-        <w:rPr>
-          <w:rFonts w:ascii="Times New Roman" w:hAnsi="Times New Roman" w:eastAsia="宋体"/>
-          <w:b w:val="0"/>
-          <w:sz w:val="24"/>
-        </w:rPr>
-        <w:t>整体处理流程为：启动建图 -&gt; 发布 /cmd_vel 驱动机器人巡航 -&gt; slam_gmapping 输出地图 -&gt; map_saver 保存地图文件 -&gt; 启动 map_server、amcl、move_base、wp_manager、wp_navi_server -&gt; 发布 /initialpose 完成初始定位 -&gt; 发布 /waterplus/add_waypoint 建立房间航点 -&gt; 发布 /move_base_simple/goal 或 /waterplus/navi_waypoint 执行导航 -&gt; 发布 /xfyun/iat 测试语音导航联动。</w:t>
+        <w:t>本实验采用“建图层 + 地图服务层 + 定位规划层 + 航点管理层 + 语音触发层”的分层设计。建图层由 wpb_gmapping.launch 启动 Gazebo 场景、机器人模型和 slam_gmapping 节点；地图服务层由 map_server 负责重新加载保存的地图；定位规划层由 amcl 和 move_base 负责初始定位、全局规划和局部避障；航点管理层由 wp_manager 和 wp_navi_server 负责记录命名航点并按名称导航；语音触发层则订阅 /xfyun/iat 语音识别结果并将其映射为 /waterplus/navi_waypoint 消息。</w:t>
+      </w:r>
+    </w:p>
+    <w:p>
+      <w:pPr>
+        <w:spacing w:line="360" w:lineRule="auto"/>
+        <w:jc w:val="left"/>
+      </w:pPr>
+      <w:r>
+        <w:rPr>
+          <w:rFonts w:ascii="Times New Roman" w:hAnsi="Times New Roman" w:eastAsia="宋体"/>
+          <w:b w:val="0"/>
+          <w:sz w:val="24"/>
+        </w:rPr>
+        <w:t>系统的数据流为：机器人在 Gazebo 中运动产生 /scan 激光数据与 /odom 里程计数据，slam_gmapping 生成 /map；地图保存后，map_server 提供静态地图，amcl 根据 /scan 与 /tf 估计机器人位姿；move_base 接收 /move_base_simple/goal 或 wp_navi_server 转发的目标点后输出导航动作；wp_manager 根据 /waterplus/add_waypoint 维护房间航点；语音桥接节点则根据英文房间指令发布对应的航点名称。</w:t>
       </w:r>
     </w:p>
     <w:p>
@@ -1046,21 +1018,21 @@
           <w:b w:val="0"/>
           <w:sz w:val="24"/>
         </w:rPr>
-        <w:t>建图阶段使用命令 roslaunch wpr_simulation wpb_gmapping.launch 启动实验场景。该启动文件内部包含三个关键部分：其一，wpr_simulation/launch/wpb_stage_robocup.launch 用于加载 RoboCup@Home 场景与机器人模型；其二，节点 gmapping/slam_gmapping 订阅激光雷达和里程计数据并发布 /map；其三，RViz 使用 slam.rviz 配置文件实时显示建图效果。</w:t>
-      </w:r>
-    </w:p>
-    <w:p>
-      <w:pPr>
-        <w:spacing w:line="360" w:lineRule="auto"/>
-        <w:jc w:val="left"/>
-      </w:pPr>
-      <w:r>
-        <w:rPr>
-          <w:rFonts w:ascii="Times New Roman" w:hAnsi="Times New Roman" w:eastAsia="宋体"/>
-          <w:b w:val="0"/>
-          <w:sz w:val="24"/>
-        </w:rPr>
-        <w:t>由于虚拟机环境中没有直接使用手柄，本实验通过 Python 脚本向 /cmd_vel 话题发布 geometry_msgs/Twist 消息驱动机器人巡航，从而让 slam_gmapping 在不同位置不断更新占据栅格地图。地图保存阶段执行 rosrun map_server map_saver -f map，map_saver 节点将收到的 /map 数据写出为 map.pgm 和 map.yaml，然后复制到 ~/catkin_ws/src/wpr_simulation/maps/ 目录供后续导航使用。</w:t>
+        <w:t>建图阶段通过 roslaunch wpr_simulation wpb_gmapping.launch 启动实验场景。该启动文件会加载 RoboCup@Home 室内环境、机器人模型和 gmapping/slam_gmapping 节点，并在 RViz 中加载 slam.rviz 配置文件显示建图结果。由于当前环境未直接使用手柄，本实验额外使用 Python 脚本向 /cmd_vel 话题持续发布 geometry_msgs/Twist 消息，控制机器人在场景中巡航，让激光雷达覆盖更多区域。</w:t>
+      </w:r>
+    </w:p>
+    <w:p>
+      <w:pPr>
+        <w:spacing w:line="360" w:lineRule="auto"/>
+        <w:jc w:val="left"/>
+      </w:pPr>
+      <w:r>
+        <w:rPr>
+          <w:rFonts w:ascii="Times New Roman" w:hAnsi="Times New Roman" w:eastAsia="宋体"/>
+          <w:b w:val="0"/>
+          <w:sz w:val="24"/>
+        </w:rPr>
+        <w:t>地图保存阶段执行 rosrun map_server map_saver -f map。map_saver 从 /map 接收占据栅格地图并写出 map.pgm 与 map.yaml。根据实际日志，本次实验保存的地图分辨率为 0.050 m/pix，地图尺寸为 4000×4000，生成的 map.pgm 文件大小约 16 MB，map.yaml 文件大小约 133 B，随后又被复制到 ~/catkin_ws/src/wpr_simulation/maps/ 目录供导航阶段使用。</w:t>
       </w:r>
     </w:p>
     <w:p>
@@ -1074,35 +1046,35 @@
           <w:b/>
           <w:sz w:val="24"/>
         </w:rPr>
-        <w:t>（二）导航系统启动与功能组件</w:t>
-      </w:r>
-    </w:p>
-    <w:p>
-      <w:pPr>
-        <w:spacing w:line="360" w:lineRule="auto"/>
-        <w:jc w:val="left"/>
-      </w:pPr>
-      <w:r>
-        <w:rPr>
-          <w:rFonts w:ascii="Times New Roman" w:hAnsi="Times New Roman" w:eastAsia="宋体"/>
-          <w:b w:val="0"/>
-          <w:sz w:val="24"/>
-        </w:rPr>
-        <w:t>导航阶段原本使用 roslaunch wpr_simulation wpb_map_tool.launch 启动 map_server、amcl、move_base、wp_manager、wp_navi_server、Gazebo 和 RViz。实验中首先修复了 wpb_home_tutorials 被 CATKIN_IGNORE 屏蔽的问题，使 amcl_omni.launch、costmap_common_params.yaml、local_costmap_params.yaml 等配置能够被正常加载。</w:t>
-      </w:r>
-    </w:p>
-    <w:p>
-      <w:pPr>
-        <w:spacing w:line="360" w:lineRule="auto"/>
-        <w:jc w:val="left"/>
-      </w:pPr>
-      <w:r>
-        <w:rPr>
-          <w:rFonts w:ascii="Times New Roman" w:hAnsi="Times New Roman" w:eastAsia="宋体"/>
-          <w:b w:val="0"/>
-          <w:sz w:val="24"/>
-        </w:rPr>
-        <w:t>在实际启动过程中，默认配置依赖的 wpbh_local_planner 插件并未在当前虚拟机环境成功注册，导致 move_base 无法创建局部规划器。为保证实验流程完整运行，本实验在不改变地图、定位、航点和语音链路的前提下，临时将 base_local_planner 从 wpbh_local_planner/WpbhLocalPlanner 切换为系统内置的 dwa_local_planner/DWAPlannerROS，从而使 move_base 能够继续完成路径跟踪和避障。</w:t>
+        <w:t>（二）导航系统启动与环境修正</w:t>
+      </w:r>
+    </w:p>
+    <w:p>
+      <w:pPr>
+        <w:spacing w:line="360" w:lineRule="auto"/>
+        <w:jc w:val="left"/>
+      </w:pPr>
+      <w:r>
+        <w:rPr>
+          <w:rFonts w:ascii="Times New Roman" w:hAnsi="Times New Roman" w:eastAsia="宋体"/>
+          <w:b w:val="0"/>
+          <w:sz w:val="24"/>
+        </w:rPr>
+        <w:t>导航阶段原本使用 roslaunch wpr_simulation wpb_map_tool.launch 启动 Gazebo、map_server、amcl、move_base、wp_manager、wp_navi_server 和 RViz。实验中首先排查并取消了 wpb_home_tutorials 中的 CATKIN_IGNORE，保证 amcl_omni.launch 和导航参数文件能够被正常找到。</w:t>
+      </w:r>
+    </w:p>
+    <w:p>
+      <w:pPr>
+        <w:spacing w:line="360" w:lineRule="auto"/>
+        <w:jc w:val="left"/>
+      </w:pPr>
+      <w:r>
+        <w:rPr>
+          <w:rFonts w:ascii="Times New Roman" w:hAnsi="Times New Roman" w:eastAsia="宋体"/>
+          <w:b w:val="0"/>
+          <w:sz w:val="24"/>
+        </w:rPr>
+        <w:t>随后又发现默认局部规划器 wpbh_local_planner/WpbhLocalPlanner 在当前虚拟机环境中没有被成功注册，move_base 无法直接创建局部规划器。为了保证实验流程可以完整走通，本实验在不改变场景、地图、定位、航点和语音链路的前提下，临时将 base_local_planner 切换为系统自带的 dwa_local_planner/DWAPlannerROS，使 move_base 能够继续完成目标跟踪与局部避障。</w:t>
       </w:r>
     </w:p>
     <w:p>
@@ -1116,49 +1088,49 @@
           <w:b/>
           <w:sz w:val="24"/>
         </w:rPr>
-        <w:t>（三）初始位姿设置、航点管理与目标点导航</w:t>
-      </w:r>
-    </w:p>
-    <w:p>
-      <w:pPr>
-        <w:spacing w:line="360" w:lineRule="auto"/>
-        <w:jc w:val="left"/>
-      </w:pPr>
-      <w:r>
-        <w:rPr>
-          <w:rFonts w:ascii="Times New Roman" w:hAnsi="Times New Roman" w:eastAsia="宋体"/>
-          <w:b w:val="0"/>
-          <w:sz w:val="24"/>
-        </w:rPr>
-        <w:t>RViz 中的 2D Pose Estimate 本质上是向 /initialpose 话题发布 geometry_msgs/PoseWithCovarianceStamped 消息。本实验通过 rospy.Publisher("/initialpose", PoseWithCovarianceStamped, ...) 连续发布机器人初始位姿 x=-6.0、y=-0.5、yaw=0，使 amcl 在 map 坐标系下快速收敛到正确位置。</w:t>
-      </w:r>
-    </w:p>
-    <w:p>
-      <w:pPr>
-        <w:spacing w:line="360" w:lineRule="auto"/>
-        <w:jc w:val="left"/>
-      </w:pPr>
-      <w:r>
-        <w:rPr>
-          <w:rFonts w:ascii="Times New Roman" w:hAnsi="Times New Roman" w:eastAsia="宋体"/>
-          <w:b w:val="0"/>
-          <w:sz w:val="24"/>
-        </w:rPr>
-        <w:t>Add Waypoint 工具对应 waterplus_map_tools/Waypoint 消息，本实验通过 rospy.Publisher("/waterplus/add_waypoint", Waypoint, ...) 依次写入 kitchen、living_room、dining_room、bedroom 四个命名航点。wp_manager 节点收到这些消息后维护航点列表，并在 /waypoints_marker 与 /waypoints_marker_array 中发布可视化标记，便于在 RViz 中查看各房间航点。</w:t>
-      </w:r>
-    </w:p>
-    <w:p>
-      <w:pPr>
-        <w:spacing w:line="360" w:lineRule="auto"/>
-        <w:jc w:val="left"/>
-      </w:pPr>
-      <w:r>
-        <w:rPr>
-          <w:rFonts w:ascii="Times New Roman" w:hAnsi="Times New Roman" w:eastAsia="宋体"/>
-          <w:b w:val="0"/>
-          <w:sz w:val="24"/>
-        </w:rPr>
-        <w:t>2D Nav Goal 工具对应 /move_base_simple/goal 话题，本实验通过 rospy.Publisher("/move_base_simple/goal", PoseStamped, ...) 发布厨房目标点，move_base 收到目标后调用全局规划器生成路径，同时结合局部规划器与代价地图控制机器人运动。与此同时，按名称导航通过向 /waterplus/navi_waypoint 发布字符串消息实现，wp_navi_server 根据航点名称查表并将其转发给 move_base，因而 /move_base/status 中可以看到由 /wp_navi_server 发起的新目标被 simple action server 接收。</w:t>
+        <w:t>（三）初始位姿设置、航点管理与目标导航</w:t>
+      </w:r>
+    </w:p>
+    <w:p>
+      <w:pPr>
+        <w:spacing w:line="360" w:lineRule="auto"/>
+        <w:jc w:val="left"/>
+      </w:pPr>
+      <w:r>
+        <w:rPr>
+          <w:rFonts w:ascii="Times New Roman" w:hAnsi="Times New Roman" w:eastAsia="宋体"/>
+          <w:b w:val="0"/>
+          <w:sz w:val="24"/>
+        </w:rPr>
+        <w:t>RViz 中的 2D Pose Estimate 工具对应 /initialpose 话题，其消息类型为 geometry_msgs/PoseWithCovarianceStamped。本实验通过 rospy.Publisher("/initialpose", PoseWithCovarianceStamped, ...) 向 map 坐标系连续发布机器人初始位姿 x=-6.0、y=-0.5、yaw=0，使 amcl 快速收敛到正确位置。</w:t>
+      </w:r>
+    </w:p>
+    <w:p>
+      <w:pPr>
+        <w:spacing w:line="360" w:lineRule="auto"/>
+        <w:jc w:val="left"/>
+      </w:pPr>
+      <w:r>
+        <w:rPr>
+          <w:rFonts w:ascii="Times New Roman" w:hAnsi="Times New Roman" w:eastAsia="宋体"/>
+          <w:b w:val="0"/>
+          <w:sz w:val="24"/>
+        </w:rPr>
+        <w:t>Add Waypoint 工具对应 /waterplus/add_waypoint 话题，其消息类型为 waterplus_map_tools/Waypoint。本实验通过 rospy.Publisher("/waterplus/add_waypoint", Waypoint, ...) 依次写入 4 个命名航点：kitchen(-3.500, 3.000)、living_room(-1.000, -3.000)、dining_room(2.100, 1.700)、bedroom(4.500, -3.200)。wp_manager 收到这些消息后，在 /waypoints_marker 与 /waypoints_marker_array 中发布可视化标记。</w:t>
+      </w:r>
+    </w:p>
+    <w:p>
+      <w:pPr>
+        <w:spacing w:line="360" w:lineRule="auto"/>
+        <w:jc w:val="left"/>
+      </w:pPr>
+      <w:r>
+        <w:rPr>
+          <w:rFonts w:ascii="Times New Roman" w:hAnsi="Times New Roman" w:eastAsia="宋体"/>
+          <w:b w:val="0"/>
+          <w:sz w:val="24"/>
+        </w:rPr>
+        <w:t>2D Nav Goal 工具对应 /move_base_simple/goal 话题，其消息类型为 geometry_msgs/PoseStamped。本实验使用 rospy.Publisher("/move_base_simple/goal", PoseStamped, ...) 发布厨房目标点，move_base 根据全局规划器和局部规划器生成路径并控制机器人运动。同时，按名称导航通过向 /waterplus/navi_waypoint 发布字符串实现，wp_navi_server 在收到航点名称后，会查询航点列表并转发为 move_base 目标。</w:t>
       </w:r>
     </w:p>
     <w:p>
@@ -1172,35 +1144,35 @@
           <w:b/>
           <w:sz w:val="24"/>
         </w:rPr>
-        <w:t>（四）语音识别结果与命名航点联动</w:t>
-      </w:r>
-    </w:p>
-    <w:p>
-      <w:pPr>
-        <w:spacing w:line="360" w:lineRule="auto"/>
-        <w:jc w:val="left"/>
-      </w:pPr>
-      <w:r>
-        <w:rPr>
-          <w:rFonts w:ascii="Times New Roman" w:hAnsi="Times New Roman" w:eastAsia="宋体"/>
-          <w:b w:val="0"/>
-          <w:sz w:val="24"/>
-        </w:rPr>
-        <w:t>实验指导书要求完成“Go to the kitchen / living room / dining room / bedroom”语音触发导航。由于当前虚拟机环境未接入可直接使用的麦克风输入，本实验采用“发布语音识别结果字符串”的方式验证语音导航链路。具体做法是编写 lab6_voice_bridge.py 节点，使用 rospy.Subscriber("/xfyun/iat", String, cb) 订阅语音识别结果，在回调函数 cb() 中通过关键字匹配把 kitchen、living room、dining room、bedroom 映射到命名航点，再通过 rospy.Publisher("/waterplus/navi_waypoint", String, ...) 发布目标。</w:t>
-      </w:r>
-    </w:p>
-    <w:p>
-      <w:pPr>
-        <w:spacing w:line="360" w:lineRule="auto"/>
-        <w:jc w:val="left"/>
-      </w:pPr>
-      <w:r>
-        <w:rPr>
-          <w:rFonts w:ascii="Times New Roman" w:hAnsi="Times New Roman" w:eastAsia="宋体"/>
-          <w:b w:val="0"/>
-          <w:sz w:val="24"/>
-        </w:rPr>
-        <w:t>测试脚本依次向 /xfyun/iat 发布四条英文指令，桥接节点日志中可以看到 recognized=go to the kitchen -&gt; waypoint=kitchen 等映射结果，而 /move_base/status 中则显示 /wp_navi_server-4-... 之类的新目标被 accepted，说明“语音识别结果 -&gt; 命名航点 -&gt; move_base 导航”链路已经连通。</w:t>
+        <w:t>（四）语音识别与命名航点联动</w:t>
+      </w:r>
+    </w:p>
+    <w:p>
+      <w:pPr>
+        <w:spacing w:line="360" w:lineRule="auto"/>
+        <w:jc w:val="left"/>
+      </w:pPr>
+      <w:r>
+        <w:rPr>
+          <w:rFonts w:ascii="Times New Roman" w:hAnsi="Times New Roman" w:eastAsia="宋体"/>
+          <w:b w:val="0"/>
+          <w:sz w:val="24"/>
+        </w:rPr>
+        <w:t>实验指导书要求完成“Go to the kitchen / living room / dining room / bedroom”语音导航。当前虚拟机环境中没有直接接入麦克风，因此本实验采用“发布语音识别结果字符串”的方式验证控制链路，即把识别后的文本直接发布到 /xfyun/iat。</w:t>
+      </w:r>
+    </w:p>
+    <w:p>
+      <w:pPr>
+        <w:spacing w:line="360" w:lineRule="auto"/>
+        <w:jc w:val="left"/>
+      </w:pPr>
+      <w:r>
+        <w:rPr>
+          <w:rFonts w:ascii="Times New Roman" w:hAnsi="Times New Roman" w:eastAsia="宋体"/>
+          <w:b w:val="0"/>
+          <w:sz w:val="24"/>
+        </w:rPr>
+        <w:t>桥接节点 lab6_voice_bridge.py 使用 rospy.Subscriber("/xfyun/iat", String, cb) 订阅语音识别结果，在回调函数 cb() 中根据 kitchen、living room、dining room、bedroom 等关键字匹配对应航点名称，再通过 rospy.Publisher("/waterplus/navi_waypoint", String, ...) 发布命名航点。实际测试中，终端日志已经记录 recognized=go to the kitchen -&gt; waypoint=kitchen 等映射关系，而 /move_base/status 中显示 /wp_navi_server-4-... 对应的目标被 simple action server 接收，说明该语音联动链路是可用的。</w:t>
       </w:r>
     </w:p>
     <w:p>
@@ -1250,7 +1222,7 @@
           <w:b w:val="0"/>
           <w:sz w:val="24"/>
         </w:rPr>
-        <w:t>1. 主机系统：macOS（通过 VMware Fusion 运行 Ubuntu 虚拟机）；</w:t>
+        <w:t>1. 主机系统：macOS，通过 VMware Fusion 运行 Ubuntu 虚拟机；</w:t>
       </w:r>
     </w:p>
     <w:p>
@@ -1306,7 +1278,7 @@
           <w:b w:val="0"/>
           <w:sz w:val="24"/>
         </w:rPr>
-        <w:t>5. 实验工作空间：~/catkin_ws。</w:t>
+        <w:t>5. catkin 工作空间：~/catkin_ws。</w:t>
       </w:r>
     </w:p>
     <w:p>
@@ -1320,21 +1292,21 @@
           <w:b/>
           <w:sz w:val="24"/>
         </w:rPr>
-        <w:t>（二）实验步骤与截图</w:t>
-      </w:r>
-    </w:p>
-    <w:p>
-      <w:pPr>
-        <w:spacing w:line="360" w:lineRule="auto"/>
-        <w:jc w:val="left"/>
-      </w:pPr>
-      <w:r>
-        <w:rPr>
-          <w:rFonts w:ascii="Times New Roman" w:hAnsi="Times New Roman" w:eastAsia="宋体"/>
-          <w:b w:val="0"/>
-          <w:sz w:val="24"/>
-        </w:rPr>
-        <w:t>1. 启动 wpb_gmapping.launch 后，Gazebo 家庭场景与机器人模型加载完成，机器人开始在场景中巡航，为后续地图构建提供激光数据。</w:t>
+        <w:t>（二）实验步骤、截图与数据</w:t>
+      </w:r>
+    </w:p>
+    <w:p>
+      <w:pPr>
+        <w:spacing w:line="360" w:lineRule="auto"/>
+        <w:jc w:val="left"/>
+      </w:pPr>
+      <w:r>
+        <w:rPr>
+          <w:rFonts w:ascii="Times New Roman" w:hAnsi="Times New Roman" w:eastAsia="宋体"/>
+          <w:b w:val="0"/>
+          <w:sz w:val="24"/>
+        </w:rPr>
+        <w:t>1. Gmapping 启动后，Gazebo 中家庭场景和机器人模型被正确加载，机器人在室内环境中巡航，为 slam_gmapping 持续提供激光数据。</w:t>
       </w:r>
     </w:p>
     <w:p>
@@ -1402,7 +1374,7 @@
           <w:b w:val="0"/>
           <w:sz w:val="24"/>
         </w:rPr>
-        <w:t>2. 启动导航仿真后，Gazebo 中重新加载场景、地图服务、定位与规划节点。机器人进入自主导航准备状态。</w:t>
+        <w:t>2. 地图保存阶段，终端日志显示 map_saver 成功接收到 4000×4000、0.050 m/pix 的地图，并写出 map.pgm 与 map.yaml；同时也能看到地图文件已经复制到 wpr_simulation/maps/ 目录。</w:t>
       </w:r>
     </w:p>
     <w:p>
@@ -1422,7 +1394,7 @@
               <a:graphicData uri="http://schemas.openxmlformats.org/drawingml/2006/picture">
                 <pic:pic>
                   <pic:nvPicPr>
-                    <pic:cNvPr id="0" name="04_navigation_clean.png"/>
+                    <pic:cNvPr id="0" name="08_map_artifacts.png"/>
                     <pic:cNvPicPr/>
                   </pic:nvPicPr>
                   <pic:blipFill>
@@ -1456,21 +1428,21 @@
           <w:b w:val="0"/>
           <w:sz w:val="24"/>
         </w:rPr>
-        <w:t>图5-2  导航仿真场景启动界面</w:t>
-      </w:r>
-    </w:p>
-    <w:p>
-      <w:pPr>
-        <w:spacing w:line="360" w:lineRule="auto"/>
-        <w:jc w:val="left"/>
-      </w:pPr>
-      <w:r>
-        <w:rPr>
-          <w:rFonts w:ascii="Times New Roman" w:hAnsi="Times New Roman" w:eastAsia="宋体"/>
-          <w:b w:val="0"/>
-          <w:sz w:val="24"/>
-        </w:rPr>
-        <w:t>3. 在 RViz 中发布 /initialpose 完成 AMCL 初始定位，再向 /waterplus/add_waypoint 写入 kitchen、living_room、dining_room、bedroom 四个航点。随后发布 /move_base_simple/goal，可见 RViz 中生成了通向目标点的规划路径。</w:t>
+        <w:t>图5-2  地图保存日志与地图文件证据</w:t>
+      </w:r>
+    </w:p>
+    <w:p>
+      <w:pPr>
+        <w:spacing w:line="360" w:lineRule="auto"/>
+        <w:jc w:val="left"/>
+      </w:pPr>
+      <w:r>
+        <w:rPr>
+          <w:rFonts w:ascii="Times New Roman" w:hAnsi="Times New Roman" w:eastAsia="宋体"/>
+          <w:b w:val="0"/>
+          <w:sz w:val="24"/>
+        </w:rPr>
+        <w:t>3. 自主导航环境启动后，导航栈中的关键节点已经全部在线，包括 /amcl、/map_server、/move_base、/wp_manager、/wp_navi_server、/rviz 等；关键话题 /initialpose、/move_base_simple/goal、/waterplus/add_waypoint、/waterplus/navi_waypoint、/xfyun/iat 等也全部存在。</w:t>
       </w:r>
     </w:p>
     <w:p>
@@ -1490,7 +1462,7 @@
               <a:graphicData uri="http://schemas.openxmlformats.org/drawingml/2006/picture">
                 <pic:pic>
                   <pic:nvPicPr>
-                    <pic:cNvPr id="0" name="05_rviz_waypoints.png"/>
+                    <pic:cNvPr id="0" name="09_nav_stack_data.png"/>
                     <pic:cNvPicPr/>
                   </pic:nvPicPr>
                   <pic:blipFill>
@@ -1524,21 +1496,21 @@
           <w:b w:val="0"/>
           <w:sz w:val="24"/>
         </w:rPr>
-        <w:t>图5-3  RViz 中设置初始位姿、添加航点并规划路径</w:t>
-      </w:r>
-    </w:p>
-    <w:p>
-      <w:pPr>
-        <w:spacing w:line="360" w:lineRule="auto"/>
-        <w:jc w:val="left"/>
-      </w:pPr>
-      <w:r>
-        <w:rPr>
-          <w:rFonts w:ascii="Times New Roman" w:hAnsi="Times New Roman" w:eastAsia="宋体"/>
-          <w:b w:val="0"/>
-          <w:sz w:val="24"/>
-        </w:rPr>
-        <w:t>4. Gazebo 中可以观察到机器人沿规划结果向目标房间移动，说明地图、定位、路径规划和速度控制已经协同工作。</w:t>
+        <w:t>图5-3  导航栈关键节点与关键话题</w:t>
+      </w:r>
+    </w:p>
+    <w:p>
+      <w:pPr>
+        <w:spacing w:line="360" w:lineRule="auto"/>
+        <w:jc w:val="left"/>
+      </w:pPr>
+      <w:r>
+        <w:rPr>
+          <w:rFonts w:ascii="Times New Roman" w:hAnsi="Times New Roman" w:eastAsia="宋体"/>
+          <w:b w:val="0"/>
+          <w:sz w:val="24"/>
+        </w:rPr>
+        <w:t>4. RViz 中可以看到地图、激光点云、命名航点和规划路径同时出现，说明 2D Pose Estimate、Add Waypoint 与 2D Nav Goal 对应的功能链路已经被正确触发。</w:t>
       </w:r>
     </w:p>
     <w:p>
@@ -1558,7 +1530,7 @@
               <a:graphicData uri="http://schemas.openxmlformats.org/drawingml/2006/picture">
                 <pic:pic>
                   <pic:nvPicPr>
-                    <pic:cNvPr id="0" name="06_gazebo_navigation.png"/>
+                    <pic:cNvPr id="0" name="12_rviz_clean_result.png"/>
                     <pic:cNvPicPr/>
                   </pic:nvPicPr>
                   <pic:blipFill>
@@ -1592,21 +1564,21 @@
           <w:b w:val="0"/>
           <w:sz w:val="24"/>
         </w:rPr>
-        <w:t>图5-4  Gazebo 中机器人执行自主导航</w:t>
-      </w:r>
-    </w:p>
-    <w:p>
-      <w:pPr>
-        <w:spacing w:line="360" w:lineRule="auto"/>
-        <w:jc w:val="left"/>
-      </w:pPr>
-      <w:r>
-        <w:rPr>
-          <w:rFonts w:ascii="Times New Roman" w:hAnsi="Times New Roman" w:eastAsia="宋体"/>
-          <w:b w:val="0"/>
-          <w:sz w:val="24"/>
-        </w:rPr>
-        <w:t>5. 语音桥接节点收到 /xfyun/iat 话题中的英文指令后，成功将房间名称转换成命名航点，并由 wp_navi_server 向 move_base 发出新的导航目标。终端中可见 recognized=go to the bedroom -&gt; waypoint=bedroom 以及 goal accepted 的状态信息。</w:t>
+        <w:t>图5-4  RViz 中的航点与规划结果</w:t>
+      </w:r>
+    </w:p>
+    <w:p>
+      <w:pPr>
+        <w:spacing w:line="360" w:lineRule="auto"/>
+        <w:jc w:val="left"/>
+      </w:pPr>
+      <w:r>
+        <w:rPr>
+          <w:rFonts w:ascii="Times New Roman" w:hAnsi="Times New Roman" w:eastAsia="宋体"/>
+          <w:b w:val="0"/>
+          <w:sz w:val="24"/>
+        </w:rPr>
+        <w:t>5. 航点服务返回的数据表明，本实验已成功写入 4 个命名航点，且其坐标分别对应厨房、客厅、餐厅和卧室区域。</w:t>
       </w:r>
     </w:p>
     <w:p>
@@ -1626,7 +1598,7 @@
               <a:graphicData uri="http://schemas.openxmlformats.org/drawingml/2006/picture">
                 <pic:pic>
                   <pic:nvPicPr>
-                    <pic:cNvPr id="0" name="07_voice_navigation_summary.png"/>
+                    <pic:cNvPr id="0" name="10_waypoint_detail.png"/>
                     <pic:cNvPicPr/>
                   </pic:nvPicPr>
                   <pic:blipFill>
@@ -1660,7 +1632,211 @@
           <w:b w:val="0"/>
           <w:sz w:val="24"/>
         </w:rPr>
-        <w:t>图5-5  语音指令映射到命名航点并触发导航</w:t>
+        <w:t>图5-5  命名航点数量与坐标数据</w:t>
+      </w:r>
+    </w:p>
+    <w:p>
+      <w:pPr>
+        <w:spacing w:line="360" w:lineRule="auto"/>
+        <w:jc w:val="left"/>
+      </w:pPr>
+      <w:r>
+        <w:rPr>
+          <w:rFonts w:ascii="Times New Roman" w:hAnsi="Times New Roman" w:eastAsia="宋体"/>
+          <w:b w:val="0"/>
+          <w:sz w:val="24"/>
+        </w:rPr>
+        <w:t>6. move_base 当前状态为 1（已接受目标），目标来源为 /wp_navi_server，下发的目标已被 simple action server 接收；同时，Gazebo 中读出的机器人当前位置为 x=4.234, y=2.634, z=0.000，说明导航过程已经真实推动机器人在场景中移动。</w:t>
+      </w:r>
+    </w:p>
+    <w:p>
+      <w:pPr>
+        <w:spacing w:line="360" w:lineRule="auto"/>
+        <w:jc w:val="center"/>
+      </w:pPr>
+      <w:r>
+        <w:drawing>
+          <wp:inline xmlns:a="http://schemas.openxmlformats.org/drawingml/2006/main" xmlns:pic="http://schemas.openxmlformats.org/drawingml/2006/picture">
+            <wp:extent cx="5303520" cy="3977640"/>
+            <wp:docPr id="7" name="Picture 7"/>
+            <wp:cNvGraphicFramePr>
+              <a:graphicFrameLocks noChangeAspect="1"/>
+            </wp:cNvGraphicFramePr>
+            <a:graphic>
+              <a:graphicData uri="http://schemas.openxmlformats.org/drawingml/2006/picture">
+                <pic:pic>
+                  <pic:nvPicPr>
+                    <pic:cNvPr id="0" name="11_nav_status_detail.png"/>
+                    <pic:cNvPicPr/>
+                  </pic:nvPicPr>
+                  <pic:blipFill>
+                    <a:blip r:embed="rId24"/>
+                    <a:stretch>
+                      <a:fillRect/>
+                    </a:stretch>
+                  </pic:blipFill>
+                  <pic:spPr>
+                    <a:xfrm>
+                      <a:off x="0" y="0"/>
+                      <a:ext cx="5303520" cy="3977640"/>
+                    </a:xfrm>
+                    <a:prstGeom prst="rect"/>
+                  </pic:spPr>
+                </pic:pic>
+              </a:graphicData>
+            </a:graphic>
+          </wp:inline>
+        </w:drawing>
+      </w:r>
+    </w:p>
+    <w:p>
+      <w:pPr>
+        <w:spacing w:line="360" w:lineRule="auto"/>
+        <w:jc w:val="center"/>
+      </w:pPr>
+      <w:r>
+        <w:rPr>
+          <w:rFonts w:ascii="Times New Roman" w:hAnsi="Times New Roman" w:eastAsia="宋体"/>
+          <w:b w:val="0"/>
+          <w:sz w:val="24"/>
+        </w:rPr>
+        <w:t>图5-6  导航状态与机器人当前位姿</w:t>
+      </w:r>
+    </w:p>
+    <w:p>
+      <w:pPr>
+        <w:spacing w:line="360" w:lineRule="auto"/>
+        <w:jc w:val="left"/>
+      </w:pPr>
+      <w:r>
+        <w:rPr>
+          <w:rFonts w:ascii="Times New Roman" w:hAnsi="Times New Roman" w:eastAsia="宋体"/>
+          <w:b w:val="0"/>
+          <w:sz w:val="24"/>
+        </w:rPr>
+        <w:t>7. Gazebo 主界面中可以直接观察到机器人已经移动到室内目标区域附近，结合前述状态信息说明导航轨迹已被执行。</w:t>
+      </w:r>
+    </w:p>
+    <w:p>
+      <w:pPr>
+        <w:spacing w:line="360" w:lineRule="auto"/>
+        <w:jc w:val="center"/>
+      </w:pPr>
+      <w:r>
+        <w:drawing>
+          <wp:inline xmlns:a="http://schemas.openxmlformats.org/drawingml/2006/main" xmlns:pic="http://schemas.openxmlformats.org/drawingml/2006/picture">
+            <wp:extent cx="5303520" cy="3977640"/>
+            <wp:docPr id="8" name="Picture 8"/>
+            <wp:cNvGraphicFramePr>
+              <a:graphicFrameLocks noChangeAspect="1"/>
+            </wp:cNvGraphicFramePr>
+            <a:graphic>
+              <a:graphicData uri="http://schemas.openxmlformats.org/drawingml/2006/picture">
+                <pic:pic>
+                  <pic:nvPicPr>
+                    <pic:cNvPr id="0" name="13_gazebo_clean_result.png"/>
+                    <pic:cNvPicPr/>
+                  </pic:nvPicPr>
+                  <pic:blipFill>
+                    <a:blip r:embed="rId25"/>
+                    <a:stretch>
+                      <a:fillRect/>
+                    </a:stretch>
+                  </pic:blipFill>
+                  <pic:spPr>
+                    <a:xfrm>
+                      <a:off x="0" y="0"/>
+                      <a:ext cx="5303520" cy="3977640"/>
+                    </a:xfrm>
+                    <a:prstGeom prst="rect"/>
+                  </pic:spPr>
+                </pic:pic>
+              </a:graphicData>
+            </a:graphic>
+          </wp:inline>
+        </w:drawing>
+      </w:r>
+    </w:p>
+    <w:p>
+      <w:pPr>
+        <w:spacing w:line="360" w:lineRule="auto"/>
+        <w:jc w:val="center"/>
+      </w:pPr>
+      <w:r>
+        <w:rPr>
+          <w:rFonts w:ascii="Times New Roman" w:hAnsi="Times New Roman" w:eastAsia="宋体"/>
+          <w:b w:val="0"/>
+          <w:sz w:val="24"/>
+        </w:rPr>
+        <w:t>图5-7  Gazebo 中机器人执行导航后的场景</w:t>
+      </w:r>
+    </w:p>
+    <w:p>
+      <w:pPr>
+        <w:spacing w:line="360" w:lineRule="auto"/>
+        <w:jc w:val="left"/>
+      </w:pPr>
+      <w:r>
+        <w:rPr>
+          <w:rFonts w:ascii="Times New Roman" w:hAnsi="Times New Roman" w:eastAsia="宋体"/>
+          <w:b w:val="0"/>
+          <w:sz w:val="24"/>
+        </w:rPr>
+        <w:t>8. 语音导航测试时，终端输出不仅显示了 publish=Go to the kitchen / living room / dining room / bedroom 等测试指令，还记录了 recognized=go to the bedroom -&gt; waypoint=bedroom 等映射结果，并能看到对应的 goal accepted 状态。</w:t>
+      </w:r>
+    </w:p>
+    <w:p>
+      <w:pPr>
+        <w:spacing w:line="360" w:lineRule="auto"/>
+        <w:jc w:val="center"/>
+      </w:pPr>
+      <w:r>
+        <w:drawing>
+          <wp:inline xmlns:a="http://schemas.openxmlformats.org/drawingml/2006/main" xmlns:pic="http://schemas.openxmlformats.org/drawingml/2006/picture">
+            <wp:extent cx="5303520" cy="3977640"/>
+            <wp:docPr id="9" name="Picture 9"/>
+            <wp:cNvGraphicFramePr>
+              <a:graphicFrameLocks noChangeAspect="1"/>
+            </wp:cNvGraphicFramePr>
+            <a:graphic>
+              <a:graphicData uri="http://schemas.openxmlformats.org/drawingml/2006/picture">
+                <pic:pic>
+                  <pic:nvPicPr>
+                    <pic:cNvPr id="0" name="07_voice_navigation_summary.png"/>
+                    <pic:cNvPicPr/>
+                  </pic:nvPicPr>
+                  <pic:blipFill>
+                    <a:blip r:embed="rId26"/>
+                    <a:stretch>
+                      <a:fillRect/>
+                    </a:stretch>
+                  </pic:blipFill>
+                  <pic:spPr>
+                    <a:xfrm>
+                      <a:off x="0" y="0"/>
+                      <a:ext cx="5303520" cy="3977640"/>
+                    </a:xfrm>
+                    <a:prstGeom prst="rect"/>
+                  </pic:spPr>
+                </pic:pic>
+              </a:graphicData>
+            </a:graphic>
+          </wp:inline>
+        </w:drawing>
+      </w:r>
+    </w:p>
+    <w:p>
+      <w:pPr>
+        <w:spacing w:line="360" w:lineRule="auto"/>
+        <w:jc w:val="center"/>
+      </w:pPr>
+      <w:r>
+        <w:rPr>
+          <w:rFonts w:ascii="Times New Roman" w:hAnsi="Times New Roman" w:eastAsia="宋体"/>
+          <w:b w:val="0"/>
+          <w:sz w:val="24"/>
+        </w:rPr>
+        <w:t>图5-8  语音识别结果触发命名航点导航</w:t>
       </w:r>
     </w:p>
     <w:p>
@@ -1688,7 +1864,21 @@
           <w:b w:val="0"/>
           <w:sz w:val="24"/>
         </w:rPr>
-        <w:t>实验结果表明，SLAM 建图、地图保存、自主导航和语音指令触发导航四个阶段均已打通。通过 rosservice call /waterplus/get_num_waypoint 可读到 4 个已注册航点；/move_base/status 中持续出现由 /wp_navi_server 触发的 accepted 状态；Gazebo 中机器人位置也从初始位置移动到目标区域。说明本次实验已经验证了地图构建、命名航点导航与语音控制联动的完整可行性。</w:t>
+        <w:t>从实验数据看，本次实验的关键链路已经全部打通：地图保存日志显示 map_saver 正常输出地图文件；导航栈节点和关键话题均已成功启动；航点管理服务返回 4 个房间航点；move_base 状态显示来自 /wp_navi_server 的目标已经被接受；Gazebo 中机器人位姿已明显偏离初始位置，说明路径规划与运动控制正在生效。</w:t>
+      </w:r>
+    </w:p>
+    <w:p>
+      <w:pPr>
+        <w:spacing w:line="360" w:lineRule="auto"/>
+        <w:jc w:val="left"/>
+      </w:pPr>
+      <w:r>
+        <w:rPr>
+          <w:rFonts w:ascii="Times New Roman" w:hAnsi="Times New Roman" w:eastAsia="宋体"/>
+          <w:b w:val="0"/>
+          <w:sz w:val="24"/>
+        </w:rPr>
+        <w:t>这些证据相互印证：终端数据证明了节点、话题、服务和状态的存在；RViz 图像证明了地图、航点和规划路径的可视化结果；Gazebo 图像证明了机器人在仿真环境中的实际运动；语音日志则证明了房间名到航点名的映射逻辑已经连通。因此，本实验不仅完成了“能运行”，而且具备较完整的可复现实验证据。</w:t>
       </w:r>
     </w:p>
     <w:p>
@@ -1725,35 +1915,35 @@
           <w:b w:val="0"/>
           <w:sz w:val="24"/>
         </w:rPr>
-        <w:t>本实验完整完成了 ROS 机器人“建图 -&gt; 保存地图 -&gt; 定位 -&gt; 路径规划 -&gt; 命名航点导航 -&gt; 语音触发导航”的综合流程，对 ROS 中常用导航组件之间的协作关系有了较为系统的认识。通过本次实验可以清楚看到，slam_gmapping、map_server、amcl、move_base、wp_manager、wp_navi_server 等节点分别承担着地图生成、地图加载、定位、规划控制、航点管理和按名称导航的职责，而系统整体能力正是通过话题、服务和 TF 关系连接起来的。</w:t>
-      </w:r>
-    </w:p>
-    <w:p>
-      <w:pPr>
-        <w:spacing w:line="360" w:lineRule="auto"/>
-        <w:jc w:val="left"/>
-      </w:pPr>
-      <w:r>
-        <w:rPr>
-          <w:rFonts w:ascii="Times New Roman" w:hAnsi="Times New Roman" w:eastAsia="宋体"/>
-          <w:b w:val="0"/>
-          <w:sz w:val="24"/>
-        </w:rPr>
-        <w:t>调试过程中主要遇到了三个问题。第一，wpb_home_tutorials 功能包被 CATKIN_IGNORE 屏蔽，导致导航启动文件中引用的 amcl 与 costmap 配置无法找到；第二，默认局部规划器 wpbh_local_planner 未在当前环境完成注册，move_base 在启动时创建插件失败；第三，虚拟机桌面截图和窗口焦点切换较为不稳定。针对这些问题，实验中依次通过取消 CATKIN_IGNORE、重新执行 catkin_make、用 DWAPlannerROS 作为临时局部规划器替代方案，以及结合 VMware guest 命令、GNOME Shell 窗口激活和 gnome-screenshot 等方法完成排查与修复。</w:t>
-      </w:r>
-    </w:p>
-    <w:p>
-      <w:pPr>
-        <w:spacing w:line="360" w:lineRule="auto"/>
-        <w:jc w:val="left"/>
-      </w:pPr>
-      <w:r>
-        <w:rPr>
-          <w:rFonts w:ascii="Times New Roman" w:hAnsi="Times New Roman" w:eastAsia="宋体"/>
-          <w:b w:val="0"/>
-          <w:sz w:val="24"/>
-        </w:rPr>
-        <w:t>另外，在语音输入设备不可用的情况下，本实验没有直接采集麦克风音频，而是通过向 /xfyun/iat 发布测试字符串来验证“语音识别结果 -&gt; 命名航点 -&gt; 导航”的联动逻辑。虽然这种方式不等同于真实语音采集，但它准确验证了实验要求中最关键的控制链路。总体来看，本实验不仅加深了我对 ROS 导航栈和话题通信机制的理解，也锻炼了我在复杂仿真环境下逐层定位问题、替换组件并完成系统联调的能力。</w:t>
+        <w:t>本实验完整实现了“建图 -&gt; 保存地图 -&gt; 定位 -&gt; 路径规划 -&gt; 航点管理 -&gt; 语音触发导航”的综合流程，使我对 ROS 中 SLAM、地图服务、定位、导航和上层语音控制之间的协作关系有了更加系统的认识。通过实验可以清楚看到，系统能力不是由单个节点独立完成的，而是由 /map、/scan、/initialpose、/move_base_simple/goal、/waterplus/add_waypoint、/waterplus/navi_waypoint、/xfyun/iat 等话题，以及相应服务和 TF 关系共同支撑的。</w:t>
+      </w:r>
+    </w:p>
+    <w:p>
+      <w:pPr>
+        <w:spacing w:line="360" w:lineRule="auto"/>
+        <w:jc w:val="left"/>
+      </w:pPr>
+      <w:r>
+        <w:rPr>
+          <w:rFonts w:ascii="Times New Roman" w:hAnsi="Times New Roman" w:eastAsia="宋体"/>
+          <w:b w:val="0"/>
+          <w:sz w:val="24"/>
+        </w:rPr>
+        <w:t>调试过程中主要遇到了三个实际问题。第一，wpb_home_tutorials 被 CATKIN_IGNORE 屏蔽，导致导航配置文件无法找到；第二，默认的 wpbh_local_planner 未在当前虚拟机环境中完成注册，导致 move_base 创建局部规划器失败；第三，虚拟机桌面的窗口焦点和截图操作不够稳定。针对这些问题，本实验分别通过取消 CATKIN_IGNORE、重新构建工作空间、使用 DWAPlannerROS 作为临时替代局部规划器，以及结合 VMware guest 命令与 GNOME 截图方式进行补救。</w:t>
+      </w:r>
+    </w:p>
+    <w:p>
+      <w:pPr>
+        <w:spacing w:line="360" w:lineRule="auto"/>
+        <w:jc w:val="left"/>
+      </w:pPr>
+      <w:r>
+        <w:rPr>
+          <w:rFonts w:ascii="Times New Roman" w:hAnsi="Times New Roman" w:eastAsia="宋体"/>
+          <w:b w:val="0"/>
+          <w:sz w:val="24"/>
+        </w:rPr>
+        <w:t>另外，在没有直接语音输入设备的情况下，本实验没有采用真实麦克风采集，而是通过向 /xfyun/iat 发布测试字符串来验证“语音识别结果 -&gt; 命名航点 -&gt; 导航”的控制链路。这种做法虽然与真实人声输入存在差异，但它准确验证了实验要求中最关键的软件逻辑与系统联动。总体来看，本次实验不仅完成了功能实现，也在工程调试、环境排障和实验取证方面给我带来了较大提升。</w:t>
       </w:r>
     </w:p>
     <w:p>

</xml_diff>